<commit_message>
Implementa melhorias no fluxo de diárias
</commit_message>
<xml_diff>
--- a/modelos/modelo_requerimento_inteira.docx
+++ b/modelos/modelo_requerimento_inteira.docx
@@ -83,7 +83,35 @@
           <w:sz w:val="22"/>
           <w:szCs w:val="22"/>
         </w:rPr>
-        <w:t>}}}, {{{cargo}}} de {{{classe}}}, {{{padrão}}}, em exercício na {{{delegacia}}}, Seccional Avaré, Deinter7-Sorocaba, brasileiro, {{{</w:t>
+        <w:t>}}}, {{{cargo}}} de {{{classe}}}, {{{padrão}}}, em exercício na {{{delegacia}}}, Seccional Avaré, Deinter7</w:t>
+      </w:r>
+      <w:r>
+        <w:rPr>
+          <w:sz w:val="22"/>
+          <w:szCs w:val="22"/>
+        </w:rPr>
+        <w:t xml:space="preserve"> </w:t>
+      </w:r>
+      <w:r>
+        <w:rPr>
+          <w:sz w:val="22"/>
+          <w:szCs w:val="22"/>
+        </w:rPr>
+        <w:t>-</w:t>
+      </w:r>
+      <w:r>
+        <w:rPr>
+          <w:sz w:val="22"/>
+          <w:szCs w:val="22"/>
+        </w:rPr>
+        <w:t xml:space="preserve"> </w:t>
+      </w:r>
+      <w:r>
+        <w:rPr>
+          <w:sz w:val="22"/>
+          <w:szCs w:val="22"/>
+        </w:rPr>
+        <w:t>Sorocaba, brasileiro, {{{</w:t>
       </w:r>
       <w:proofErr w:type="spellStart"/>
       <w:r>
@@ -131,7 +159,35 @@
           <w:sz w:val="22"/>
           <w:szCs w:val="22"/>
         </w:rPr>
-        <w:t>}}}, residente na {{{endereço}}}-SP, vem à presença de Vossa Excelência solicitar o devido encaminhamento deste expediente a apreciação do Ilustríssimo Senhor Diretor do DEINTER 7, caso necessário, da hierarquia superior, objetivando o pagamento de diária, pelos motivos de fato e direito a seguir expostos:</w:t>
+        <w:t xml:space="preserve">}}}, residente na {{{endereço}}}-SP, vem à presença de Vossa Excelência solicitar o devido encaminhamento deste expediente </w:t>
+      </w:r>
+      <w:r>
+        <w:rPr>
+          <w:sz w:val="22"/>
+          <w:szCs w:val="22"/>
+        </w:rPr>
+        <w:t>à</w:t>
+      </w:r>
+      <w:r>
+        <w:rPr>
+          <w:sz w:val="22"/>
+          <w:szCs w:val="22"/>
+        </w:rPr>
+        <w:t xml:space="preserve"> apreciação do Ilustríssimo Senhor Diretor do DEINTER 7, caso necessário, da hierarquia superior, objetivando o pagamento de diária, pelos motivos de fato e </w:t>
+      </w:r>
+      <w:r>
+        <w:rPr>
+          <w:sz w:val="22"/>
+          <w:szCs w:val="22"/>
+        </w:rPr>
+        <w:t xml:space="preserve">de </w:t>
+      </w:r>
+      <w:r>
+        <w:rPr>
+          <w:sz w:val="22"/>
+          <w:szCs w:val="22"/>
+        </w:rPr>
+        <w:t>direito a seguir expostos:</w:t>
       </w:r>
     </w:p>
     <w:p>
@@ -152,7 +208,21 @@
           <w:sz w:val="22"/>
           <w:szCs w:val="22"/>
         </w:rPr>
-        <w:t>O requerente, atendendo determinação (Escala de Plantão Policial Permanente da Central de Polícia Judiciária de {{{</w:t>
+        <w:t>O requerente, atendendo</w:t>
+      </w:r>
+      <w:r>
+        <w:rPr>
+          <w:sz w:val="22"/>
+          <w:szCs w:val="22"/>
+        </w:rPr>
+        <w:t xml:space="preserve"> à</w:t>
+      </w:r>
+      <w:r>
+        <w:rPr>
+          <w:sz w:val="22"/>
+          <w:szCs w:val="22"/>
+        </w:rPr>
+        <w:t xml:space="preserve"> determinação (Escala de Plantão Policial Permanente da Central de Polícia Judiciária de {{{</w:t>
       </w:r>
       <w:proofErr w:type="spellStart"/>
       <w:r>
@@ -475,7 +545,21 @@
           <w:szCs w:val="22"/>
         </w:rPr>
         <w:tab/>
-        <w:t>R${{{</w:t>
+        <w:t>R$</w:t>
+      </w:r>
+      <w:r>
+        <w:rPr>
+          <w:sz w:val="22"/>
+          <w:szCs w:val="22"/>
+        </w:rPr>
+        <w:t xml:space="preserve"> </w:t>
+      </w:r>
+      <w:r>
+        <w:rPr>
+          <w:sz w:val="22"/>
+          <w:szCs w:val="22"/>
+        </w:rPr>
+        <w:t>{{{</w:t>
       </w:r>
       <w:proofErr w:type="spellStart"/>
       <w:r>
@@ -832,23 +916,7 @@
           <w:sz w:val="22"/>
           <w:szCs w:val="22"/>
         </w:rPr>
-        <w:t xml:space="preserve">4- Assim, considerando a existência do direito subjetivo, com fundamento no artigo 144 da Lei 10.261 de 28/10/68, “Estatuto dos Funcionários Públicos Civis”, requeiro a Vossa Senhoria através dos mecanismos administrativos adequados, o pagamento de diárias na forma, quantia e cálculo estabelecidos nos Decretos </w:t>
-      </w:r>
-      <w:proofErr w:type="spellStart"/>
-      <w:r>
-        <w:rPr>
-          <w:sz w:val="22"/>
-          <w:szCs w:val="22"/>
-        </w:rPr>
-        <w:t>nºs</w:t>
-      </w:r>
-      <w:proofErr w:type="spellEnd"/>
-      <w:r>
-        <w:rPr>
-          <w:sz w:val="22"/>
-          <w:szCs w:val="22"/>
-        </w:rPr>
-        <w:t>. 48.292/03 de 02/12/03;</w:t>
+        <w:t>4- Assim, considerando a existência do direito subjetivo, com fundamento no artigo 144 da Lei 10.261 de 28/10/68, “Estatuto dos Funcionários Públicos Civis”, requeiro a Vossa Senhoria através dos mecanismos administrativos adequados, o pagamento de diárias na forma, quantia e cálculo estabelecidos nos Decretos nº. 48.292/03 de 02/12/03;</w:t>
       </w:r>
     </w:p>
     <w:p>

</xml_diff>

<commit_message>
Versao 20261013_001: corrige Diarias e atualiza modelos
</commit_message>
<xml_diff>
--- a/modelos/modelo_requerimento_inteira.docx
+++ b/modelos/modelo_requerimento_inteira.docx
@@ -83,7 +83,37 @@
           <w:sz w:val="22"/>
           <w:szCs w:val="22"/>
         </w:rPr>
-        <w:t>}}}, {{{cargo}}} de {{{classe}}}, {{{padrão}}}, em exercício na {{{delegacia}}}, Seccional Avaré, Deinter7</w:t>
+        <w:t>}}}, {{{cargo}}} de {{{classe}}}, {{{</w:t>
+      </w:r>
+      <w:proofErr w:type="spellStart"/>
+      <w:r>
+        <w:rPr>
+          <w:sz w:val="22"/>
+          <w:szCs w:val="22"/>
+        </w:rPr>
+        <w:t>padr</w:t>
+      </w:r>
+      <w:r>
+        <w:rPr>
+          <w:sz w:val="22"/>
+          <w:szCs w:val="22"/>
+        </w:rPr>
+        <w:t>a</w:t>
+      </w:r>
+      <w:r>
+        <w:rPr>
+          <w:sz w:val="22"/>
+          <w:szCs w:val="22"/>
+        </w:rPr>
+        <w:t>o</w:t>
+      </w:r>
+      <w:proofErr w:type="spellEnd"/>
+      <w:r>
+        <w:rPr>
+          <w:sz w:val="22"/>
+          <w:szCs w:val="22"/>
+        </w:rPr>
+        <w:t>}}}, em exercício na {{{delegacia}}}, Seccional Avaré, Deinter7</w:t>
       </w:r>
       <w:r>
         <w:rPr>
@@ -238,23 +268,7 @@
           <w:sz w:val="22"/>
           <w:szCs w:val="22"/>
         </w:rPr>
-        <w:t>}</w:t>
-      </w:r>
-      <w:proofErr w:type="gramStart"/>
-      <w:r>
-        <w:rPr>
-          <w:sz w:val="22"/>
-          <w:szCs w:val="22"/>
-        </w:rPr>
-        <w:t>}}-</w:t>
-      </w:r>
-      <w:proofErr w:type="gramEnd"/>
-      <w:r>
-        <w:rPr>
-          <w:sz w:val="22"/>
-          <w:szCs w:val="22"/>
-        </w:rPr>
-        <w:t>SP), referente a {{{</w:t>
+        <w:t>}}}-SP), referente a {{{</w:t>
       </w:r>
       <w:proofErr w:type="spellStart"/>
       <w:r>
@@ -302,23 +316,7 @@
           <w:sz w:val="22"/>
           <w:szCs w:val="22"/>
         </w:rPr>
-        <w:t>}</w:t>
-      </w:r>
-      <w:proofErr w:type="gramStart"/>
-      <w:r>
-        <w:rPr>
-          <w:sz w:val="22"/>
-          <w:szCs w:val="22"/>
-        </w:rPr>
-        <w:t>}}-</w:t>
-      </w:r>
-      <w:proofErr w:type="gramEnd"/>
-      <w:r>
-        <w:rPr>
-          <w:sz w:val="22"/>
-          <w:szCs w:val="22"/>
-        </w:rPr>
-        <w:t>SP, onde deveria assumir o plantão policial. Assim, para cumprir tal determinação, o Requerente saiu de sua sede às {{{</w:t>
+        <w:t>}}}-SP, onde deveria assumir o plantão policial. Assim, para cumprir tal determinação, o Requerente saiu de sua sede às {{{</w:t>
       </w:r>
       <w:proofErr w:type="spellStart"/>
       <w:r>
@@ -457,23 +455,7 @@
           <w:sz w:val="22"/>
           <w:szCs w:val="22"/>
         </w:rPr>
-        <w:t>}</w:t>
-      </w:r>
-      <w:proofErr w:type="gramStart"/>
-      <w:r>
-        <w:rPr>
-          <w:sz w:val="22"/>
-          <w:szCs w:val="22"/>
-        </w:rPr>
-        <w:t>}}/</w:t>
-      </w:r>
-      <w:proofErr w:type="gramEnd"/>
-      <w:r>
-        <w:rPr>
-          <w:sz w:val="22"/>
-          <w:szCs w:val="22"/>
-        </w:rPr>
-        <w:t>SSP/SP;</w:t>
+        <w:t>}}}/SSP/SP;</w:t>
       </w:r>
     </w:p>
     <w:p>
@@ -616,23 +598,7 @@
           <w:sz w:val="22"/>
           <w:szCs w:val="22"/>
         </w:rPr>
-        <w:t>}</w:t>
-      </w:r>
-      <w:proofErr w:type="gramStart"/>
-      <w:r>
-        <w:rPr>
-          <w:sz w:val="22"/>
-          <w:szCs w:val="22"/>
-        </w:rPr>
-        <w:t>}}-</w:t>
-      </w:r>
-      <w:proofErr w:type="gramEnd"/>
-      <w:r>
-        <w:rPr>
-          <w:sz w:val="22"/>
-          <w:szCs w:val="22"/>
-        </w:rPr>
-        <w:t>SP.</w:t>
+        <w:t>}}}-SP.</w:t>
       </w:r>
     </w:p>
     <w:p>
@@ -668,23 +634,7 @@
           <w:sz w:val="22"/>
           <w:szCs w:val="22"/>
         </w:rPr>
-        <w:t>}</w:t>
-      </w:r>
-      <w:proofErr w:type="gramStart"/>
-      <w:r>
-        <w:rPr>
-          <w:sz w:val="22"/>
-          <w:szCs w:val="22"/>
-        </w:rPr>
-        <w:t>}}-</w:t>
-      </w:r>
-      <w:proofErr w:type="gramEnd"/>
-      <w:r>
-        <w:rPr>
-          <w:sz w:val="22"/>
-          <w:szCs w:val="22"/>
-        </w:rPr>
-        <w:t>SP, conforme determinação contida na Escala referente a {{{</w:t>
+        <w:t>}}}-SP, conforme determinação contida na Escala referente a {{{</w:t>
       </w:r>
       <w:proofErr w:type="spellStart"/>
       <w:r>
@@ -990,23 +940,7 @@
           <w:sz w:val="22"/>
           <w:szCs w:val="22"/>
         </w:rPr>
-        <w:t>}</w:t>
-      </w:r>
-      <w:proofErr w:type="gramStart"/>
-      <w:r>
-        <w:rPr>
-          <w:sz w:val="22"/>
-          <w:szCs w:val="22"/>
-        </w:rPr>
-        <w:t>}}-</w:t>
-      </w:r>
-      <w:proofErr w:type="gramEnd"/>
-      <w:r>
-        <w:rPr>
-          <w:sz w:val="22"/>
-          <w:szCs w:val="22"/>
-        </w:rPr>
-        <w:t>SP, {{{</w:t>
+        <w:t>}}}-SP, {{{</w:t>
       </w:r>
       <w:proofErr w:type="spellStart"/>
       <w:r>

</xml_diff>

<commit_message>
Versao 20261020_001: atualiza modelos de diaria
</commit_message>
<xml_diff>
--- a/modelos/modelo_requerimento_inteira.docx
+++ b/modelos/modelo_requerimento_inteira.docx
@@ -173,7 +173,7 @@
           <w:sz w:val="22"/>
           <w:szCs w:val="22"/>
         </w:rPr>
-        <w:t>}}}, filho de {{{pai}}} {{{</w:t>
+        <w:t>}}}, filho de {{{pai}}}{{{</w:t>
       </w:r>
       <w:proofErr w:type="spellStart"/>
       <w:r>
@@ -503,7 +503,14 @@
           <w:sz w:val="22"/>
           <w:szCs w:val="22"/>
         </w:rPr>
-        <w:t xml:space="preserve"> {{{cargo}}} de {{{classe}}}, {{{</w:t>
+        <w:t xml:space="preserve"> {</w:t>
+      </w:r>
+      <w:r>
+        <w:rPr>
+          <w:sz w:val="22"/>
+          <w:szCs w:val="22"/>
+        </w:rPr>
+        <w:t>{{cargo}}} de {{{classe}}}, {{{</w:t>
       </w:r>
       <w:proofErr w:type="spellStart"/>
       <w:r>
@@ -519,15 +526,7 @@
           <w:sz w:val="22"/>
           <w:szCs w:val="22"/>
         </w:rPr>
-        <w:t xml:space="preserve">}}}, com vencimento bruto de      </w:t>
-      </w:r>
-      <w:r>
-        <w:rPr>
-          <w:sz w:val="22"/>
-          <w:szCs w:val="22"/>
-        </w:rPr>
-        <w:tab/>
-        <w:t>R$</w:t>
+        <w:t>}}}, com vencimento bruto de</w:t>
       </w:r>
       <w:r>
         <w:rPr>
@@ -541,7 +540,7 @@
           <w:sz w:val="22"/>
           <w:szCs w:val="22"/>
         </w:rPr>
-        <w:t>{{{</w:t>
+        <w:t>R$ {{{</w:t>
       </w:r>
       <w:proofErr w:type="spellStart"/>
       <w:r>

</xml_diff>